<commit_message>
Update final report (docx and pdf)
</commit_message>
<xml_diff>
--- a/IST3134_Report.docx
+++ b/IST3134_Report.docx
@@ -11,7 +11,7 @@
         <w:rPr>
           <w:b/>
           <w:bCs/>
-          <w:color w:val="1F3864"/>
+          <w:color w:val="000000"/>
           <w:sz w:val="40"/>
           <w:szCs w:val="40"/>
         </w:rPr>
@@ -373,7 +373,7 @@
         <w:tc>
           <w:tcPr>
             <w:tcW w:w="2600" w:type="dxa"/>
-            <w:shd w:val="clear" w:color="auto" w:fill="D9E2F3"/>
+            <w:shd w:val="clear" w:color="auto" w:fill="D9D9D9"/>
             <w:tcMar>
               <w:top w:w="40" w:type="dxa"/>
               <w:left w:w="80" w:type="dxa"/>
@@ -396,7 +396,7 @@
         <w:tc>
           <w:tcPr>
             <w:tcW w:w="6760" w:type="dxa"/>
-            <w:shd w:val="clear" w:color="auto" w:fill="D9E2F3"/>
+            <w:shd w:val="clear" w:color="auto" w:fill="D9D9D9"/>
             <w:tcMar>
               <w:top w:w="40" w:type="dxa"/>
               <w:left w:w="80" w:type="dxa"/>
@@ -1395,7 +1395,7 @@
         <w:tc>
           <w:tcPr>
             <w:tcW w:w="3060" w:type="dxa"/>
-            <w:shd w:val="clear" w:color="auto" w:fill="D9E2F3"/>
+            <w:shd w:val="clear" w:color="auto" w:fill="D9D9D9"/>
             <w:tcMar>
               <w:top w:w="40" w:type="dxa"/>
               <w:left w:w="80" w:type="dxa"/>
@@ -1419,7 +1419,7 @@
         <w:tc>
           <w:tcPr>
             <w:tcW w:w="2100" w:type="dxa"/>
-            <w:shd w:val="clear" w:color="auto" w:fill="D9E2F3"/>
+            <w:shd w:val="clear" w:color="auto" w:fill="D9D9D9"/>
             <w:tcMar>
               <w:top w:w="40" w:type="dxa"/>
               <w:left w:w="80" w:type="dxa"/>
@@ -1442,7 +1442,7 @@
         <w:tc>
           <w:tcPr>
             <w:tcW w:w="2400" w:type="dxa"/>
-            <w:shd w:val="clear" w:color="auto" w:fill="D9E2F3"/>
+            <w:shd w:val="clear" w:color="auto" w:fill="D9D9D9"/>
             <w:tcMar>
               <w:top w:w="40" w:type="dxa"/>
               <w:left w:w="80" w:type="dxa"/>
@@ -1465,7 +1465,7 @@
         <w:tc>
           <w:tcPr>
             <w:tcW w:w="1800" w:type="dxa"/>
-            <w:shd w:val="clear" w:color="auto" w:fill="D9E2F3"/>
+            <w:shd w:val="clear" w:color="auto" w:fill="D9D9D9"/>
             <w:tcMar>
               <w:top w:w="40" w:type="dxa"/>
               <w:left w:w="80" w:type="dxa"/>
@@ -2217,7 +2217,7 @@
         <w:tc>
           <w:tcPr>
             <w:tcW w:w="3560" w:type="dxa"/>
-            <w:shd w:val="clear" w:color="auto" w:fill="D9E2F3"/>
+            <w:shd w:val="clear" w:color="auto" w:fill="D9D9D9"/>
             <w:tcMar>
               <w:top w:w="40" w:type="dxa"/>
               <w:left w:w="80" w:type="dxa"/>
@@ -2240,7 +2240,7 @@
         <w:tc>
           <w:tcPr>
             <w:tcW w:w="2900" w:type="dxa"/>
-            <w:shd w:val="clear" w:color="auto" w:fill="D9E2F3"/>
+            <w:shd w:val="clear" w:color="auto" w:fill="D9D9D9"/>
             <w:tcMar>
               <w:top w:w="40" w:type="dxa"/>
               <w:left w:w="80" w:type="dxa"/>
@@ -2266,7 +2266,7 @@
         <w:tc>
           <w:tcPr>
             <w:tcW w:w="2900" w:type="dxa"/>
-            <w:shd w:val="clear" w:color="auto" w:fill="D9E2F3"/>
+            <w:shd w:val="clear" w:color="auto" w:fill="D9D9D9"/>
             <w:tcMar>
               <w:top w:w="40" w:type="dxa"/>
               <w:left w:w="80" w:type="dxa"/>
@@ -2832,7 +2832,7 @@
         <w:tc>
           <w:tcPr>
             <w:tcW w:w="1360" w:type="dxa"/>
-            <w:shd w:val="clear" w:color="auto" w:fill="D9E2F3"/>
+            <w:shd w:val="clear" w:color="auto" w:fill="D9D9D9"/>
             <w:tcMar>
               <w:top w:w="40" w:type="dxa"/>
               <w:left w:w="80" w:type="dxa"/>
@@ -2855,7 +2855,7 @@
         <w:tc>
           <w:tcPr>
             <w:tcW w:w="1600" w:type="dxa"/>
-            <w:shd w:val="clear" w:color="auto" w:fill="D9E2F3"/>
+            <w:shd w:val="clear" w:color="auto" w:fill="D9D9D9"/>
             <w:tcMar>
               <w:top w:w="40" w:type="dxa"/>
               <w:left w:w="80" w:type="dxa"/>
@@ -2881,7 +2881,7 @@
         <w:tc>
           <w:tcPr>
             <w:tcW w:w="1600" w:type="dxa"/>
-            <w:shd w:val="clear" w:color="auto" w:fill="D9E2F3"/>
+            <w:shd w:val="clear" w:color="auto" w:fill="D9D9D9"/>
             <w:tcMar>
               <w:top w:w="40" w:type="dxa"/>
               <w:left w:w="80" w:type="dxa"/>
@@ -2907,7 +2907,7 @@
         <w:tc>
           <w:tcPr>
             <w:tcW w:w="1400" w:type="dxa"/>
-            <w:shd w:val="clear" w:color="auto" w:fill="D9E2F3"/>
+            <w:shd w:val="clear" w:color="auto" w:fill="D9D9D9"/>
             <w:tcMar>
               <w:top w:w="40" w:type="dxa"/>
               <w:left w:w="80" w:type="dxa"/>
@@ -2933,7 +2933,7 @@
         <w:tc>
           <w:tcPr>
             <w:tcW w:w="1600" w:type="dxa"/>
-            <w:shd w:val="clear" w:color="auto" w:fill="D9E2F3"/>
+            <w:shd w:val="clear" w:color="auto" w:fill="D9D9D9"/>
             <w:tcMar>
               <w:top w:w="40" w:type="dxa"/>
               <w:left w:w="80" w:type="dxa"/>
@@ -2959,7 +2959,7 @@
         <w:tc>
           <w:tcPr>
             <w:tcW w:w="1800" w:type="dxa"/>
-            <w:shd w:val="clear" w:color="auto" w:fill="D9E2F3"/>
+            <w:shd w:val="clear" w:color="auto" w:fill="D9D9D9"/>
             <w:tcMar>
               <w:top w:w="40" w:type="dxa"/>
               <w:left w:w="80" w:type="dxa"/>
@@ -3749,7 +3749,7 @@
         <w:tc>
           <w:tcPr>
             <w:tcW w:w="1700" w:type="dxa"/>
-            <w:shd w:val="clear" w:color="auto" w:fill="D9E2F3"/>
+            <w:shd w:val="clear" w:color="auto" w:fill="D9D9D9"/>
             <w:tcMar>
               <w:top w:w="40" w:type="dxa"/>
               <w:left w:w="80" w:type="dxa"/>
@@ -3772,7 +3772,7 @@
         <w:tc>
           <w:tcPr>
             <w:tcW w:w="1900" w:type="dxa"/>
-            <w:shd w:val="clear" w:color="auto" w:fill="D9E2F3"/>
+            <w:shd w:val="clear" w:color="auto" w:fill="D9D9D9"/>
             <w:tcMar>
               <w:top w:w="40" w:type="dxa"/>
               <w:left w:w="80" w:type="dxa"/>
@@ -3798,7 +3798,7 @@
         <w:tc>
           <w:tcPr>
             <w:tcW w:w="1650" w:type="dxa"/>
-            <w:shd w:val="clear" w:color="auto" w:fill="D9E2F3"/>
+            <w:shd w:val="clear" w:color="auto" w:fill="D9D9D9"/>
             <w:tcMar>
               <w:top w:w="40" w:type="dxa"/>
               <w:left w:w="80" w:type="dxa"/>
@@ -3835,7 +3835,7 @@
         <w:tc>
           <w:tcPr>
             <w:tcW w:w="2160" w:type="dxa"/>
-            <w:shd w:val="clear" w:color="auto" w:fill="D9E2F3"/>
+            <w:shd w:val="clear" w:color="auto" w:fill="D9D9D9"/>
             <w:tcMar>
               <w:top w:w="40" w:type="dxa"/>
               <w:left w:w="80" w:type="dxa"/>
@@ -3872,7 +3872,7 @@
         <w:tc>
           <w:tcPr>
             <w:tcW w:w="1950" w:type="dxa"/>
-            <w:shd w:val="clear" w:color="auto" w:fill="D9E2F3"/>
+            <w:shd w:val="clear" w:color="auto" w:fill="D9D9D9"/>
             <w:tcMar>
               <w:top w:w="40" w:type="dxa"/>
               <w:left w:w="80" w:type="dxa"/>
@@ -5535,7 +5535,7 @@
     <w:rPr>
       <w:b/>
       <w:bCs/>
-      <w:color w:val="1F3864"/>
+      <w:color w:val="000000"/>
       <w:sz w:val="30"/>
       <w:szCs w:val="30"/>
     </w:rPr>
@@ -5552,7 +5552,7 @@
     <w:rPr>
       <w:b/>
       <w:bCs/>
-      <w:color w:val="2E74B5"/>
+      <w:color w:val="000000"/>
       <w:sz w:val="25"/>
       <w:szCs w:val="25"/>
     </w:rPr>
@@ -5567,7 +5567,7 @@
       <w:outlineLvl w:val="2"/>
     </w:pPr>
     <w:rPr>
-      <w:color w:val="1F4D78"/>
+      <w:color w:val="000000"/>
       <w:sz w:val="24"/>
       <w:szCs w:val="24"/>
     </w:rPr>
@@ -5584,7 +5584,7 @@
     <w:rPr>
       <w:i/>
       <w:iCs/>
-      <w:color w:val="2E74B5"/>
+      <w:color w:val="000000"/>
     </w:rPr>
   </w:style>
   <w:style w:type="paragraph" w:styleId="Heading5">
@@ -5597,7 +5597,7 @@
       <w:outlineLvl w:val="4"/>
     </w:pPr>
     <w:rPr>
-      <w:color w:val="2E74B5"/>
+      <w:color w:val="000000"/>
     </w:rPr>
   </w:style>
   <w:style w:type="paragraph" w:styleId="Heading6">
@@ -5610,7 +5610,7 @@
       <w:outlineLvl w:val="5"/>
     </w:pPr>
     <w:rPr>
-      <w:color w:val="1F4D78"/>
+      <w:color w:val="000000"/>
     </w:rPr>
   </w:style>
   <w:style w:type="character" w:default="1" w:styleId="DefaultParagraphFont">

</xml_diff>